<commit_message>
Jobsheet 4 (Langkah 3 – Pengujian Catch-All Route)
</commit_message>
<xml_diff>
--- a/Laporan/20_Satrio Wisnu Adi Pratama_Jobsheet 4.docx
+++ b/Laporan/20_Satrio Wisnu Adi Pratama_Jobsheet 4.docx
@@ -95,7 +95,7 @@
           </mc:Choice>
           <mc:Fallback>
             <w:pict>
-              <v:shape w14:anchorId="456E03BA" id="Graphic 7" o:spid="_x0000_s1026" style="position:absolute;margin-left:56.7pt;margin-top:55.9pt;width:481.9pt;height:.1pt;z-index:251658240;visibility:visible;mso-wrap-style:square;mso-wrap-distance-left:0;mso-wrap-distance-top:0;mso-wrap-distance-right:0;mso-wrap-distance-bottom:0;mso-position-horizontal:absolute;mso-position-horizontal-relative:page;mso-position-vertical:absolute;mso-position-vertical-relative:text;v-text-anchor:top" coordsize="6120130,1270" o:gfxdata="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" path="m,l6120130,e" filled="f" strokeweight=".5pt">
+              <v:shape w14:anchorId="72A52A08" id="Graphic 7" o:spid="_x0000_s1026" style="position:absolute;margin-left:56.7pt;margin-top:55.9pt;width:481.9pt;height:.1pt;z-index:251658240;visibility:visible;mso-wrap-style:square;mso-wrap-distance-left:0;mso-wrap-distance-top:0;mso-wrap-distance-right:0;mso-wrap-distance-bottom:0;mso-position-horizontal:absolute;mso-position-horizontal-relative:page;mso-position-vertical:absolute;mso-position-vertical-relative:text;v-text-anchor:top" coordsize="6120130,1270" o:gfxdata="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" path="m,l6120130,e" filled="f" strokeweight=".5pt">
                 <v:path arrowok="t"/>
                 <w10:wrap anchorx="page"/>
               </v:shape>
@@ -1047,6 +1047,9 @@
           </w:p>
           <w:p>
             <w:r>
+              <w:rPr>
+                <w:noProof/>
+              </w:rPr>
               <w:drawing>
                 <wp:inline distT="0" distB="0" distL="0" distR="0" wp14:anchorId="668D4495" wp14:editId="548CE7D0">
                   <wp:extent cx="3124636" cy="552527"/>
@@ -1111,6 +1114,9 @@
           </w:p>
           <w:p>
             <w:r>
+              <w:rPr>
+                <w:noProof/>
+              </w:rPr>
               <w:drawing>
                 <wp:inline distT="0" distB="0" distL="0" distR="0" wp14:anchorId="607C2CD5" wp14:editId="6C74C881">
                   <wp:extent cx="3149699" cy="2019174"/>
@@ -1152,8 +1158,6 @@
             <w:r>
               <w:t xml:space="preserve">Cek menggunakan console.log apakah nilai segment berhasil didapat </w:t>
             </w:r>
-            <w:bookmarkStart w:id="0" w:name="_GoBack"/>
-            <w:bookmarkEnd w:id="0"/>
           </w:p>
           <w:p>
             <w:pPr>
@@ -1173,10 +1177,13 @@
               <w:ind w:left="720"/>
             </w:pPr>
             <w:r>
+              <w:rPr>
+                <w:noProof/>
+              </w:rPr>
               <w:drawing>
-                <wp:inline distT="0" distB="0" distL="0" distR="0" wp14:anchorId="11C0041F" wp14:editId="7F3D15DE">
-                  <wp:extent cx="2971799" cy="1351834"/>
-                  <wp:effectExtent l="0" t="0" r="635" b="1270"/>
+                <wp:inline distT="0" distB="0" distL="0" distR="0" wp14:anchorId="11C0041F" wp14:editId="12C5DA7F">
+                  <wp:extent cx="4225075" cy="1921933"/>
+                  <wp:effectExtent l="0" t="0" r="4445" b="2540"/>
                   <wp:docPr id="10" name="Picture 10"/>
                   <wp:cNvGraphicFramePr>
                     <a:graphicFrameLocks xmlns:a="http://schemas.openxmlformats.org/drawingml/2006/main" noChangeAspect="1"/>
@@ -1197,7 +1204,7 @@
                         <pic:spPr>
                           <a:xfrm>
                             <a:off x="0" y="0"/>
-                            <a:ext cx="3009228" cy="1368860"/>
+                            <a:ext cx="4341926" cy="1975087"/>
                           </a:xfrm>
                           <a:prstGeom prst="rect">
                             <a:avLst/>
@@ -1227,6 +1234,49 @@
               <w:pStyle w:val="ListParagraph"/>
               <w:ind w:left="720"/>
             </w:pPr>
+            <w:r>
+              <w:drawing>
+                <wp:inline distT="0" distB="0" distL="0" distR="0" wp14:anchorId="3B425EDE" wp14:editId="24BAAD2E">
+                  <wp:extent cx="4225925" cy="2139118"/>
+                  <wp:effectExtent l="0" t="0" r="3175" b="0"/>
+                  <wp:docPr id="5" name="Picture 5"/>
+                  <wp:cNvGraphicFramePr>
+                    <a:graphicFrameLocks xmlns:a="http://schemas.openxmlformats.org/drawingml/2006/main" noChangeAspect="1"/>
+                  </wp:cNvGraphicFramePr>
+                  <a:graphic xmlns:a="http://schemas.openxmlformats.org/drawingml/2006/main">
+                    <a:graphicData uri="http://schemas.openxmlformats.org/drawingml/2006/picture">
+                      <pic:pic xmlns:pic="http://schemas.openxmlformats.org/drawingml/2006/picture">
+                        <pic:nvPicPr>
+                          <pic:cNvPr id="1" name=""/>
+                          <pic:cNvPicPr/>
+                        </pic:nvPicPr>
+                        <pic:blipFill>
+                          <a:blip r:embed="rId14"/>
+                          <a:stretch>
+                            <a:fillRect/>
+                          </a:stretch>
+                        </pic:blipFill>
+                        <pic:spPr>
+                          <a:xfrm>
+                            <a:off x="0" y="0"/>
+                            <a:ext cx="4244001" cy="2148268"/>
+                          </a:xfrm>
+                          <a:prstGeom prst="rect">
+                            <a:avLst/>
+                          </a:prstGeom>
+                        </pic:spPr>
+                      </pic:pic>
+                    </a:graphicData>
+                  </a:graphic>
+                </wp:inline>
+              </w:drawing>
+            </w:r>
+          </w:p>
+          <w:p>
+            <w:pPr>
+              <w:pStyle w:val="ListParagraph"/>
+              <w:ind w:left="720"/>
+            </w:pPr>
           </w:p>
           <w:p>
             <w:pPr>
@@ -1237,8 +1287,58 @@
               </w:numPr>
             </w:pPr>
             <w:r>
+              <w:lastRenderedPageBreak/>
               <w:t>Modifikasi [...slug].tsx untuk menampilkan nilai query</w:t>
             </w:r>
+          </w:p>
+          <w:p>
+            <w:pPr>
+              <w:pStyle w:val="ListParagraph"/>
+              <w:ind w:left="720"/>
+            </w:pPr>
+            <w:r>
+              <w:drawing>
+                <wp:inline distT="0" distB="0" distL="0" distR="0" wp14:anchorId="021D79E1" wp14:editId="6FBEE2D7">
+                  <wp:extent cx="4081991" cy="1447384"/>
+                  <wp:effectExtent l="0" t="0" r="0" b="635"/>
+                  <wp:docPr id="11" name="Picture 11"/>
+                  <wp:cNvGraphicFramePr>
+                    <a:graphicFrameLocks xmlns:a="http://schemas.openxmlformats.org/drawingml/2006/main" noChangeAspect="1"/>
+                  </wp:cNvGraphicFramePr>
+                  <a:graphic xmlns:a="http://schemas.openxmlformats.org/drawingml/2006/main">
+                    <a:graphicData uri="http://schemas.openxmlformats.org/drawingml/2006/picture">
+                      <pic:pic xmlns:pic="http://schemas.openxmlformats.org/drawingml/2006/picture">
+                        <pic:nvPicPr>
+                          <pic:cNvPr id="1" name=""/>
+                          <pic:cNvPicPr/>
+                        </pic:nvPicPr>
+                        <pic:blipFill>
+                          <a:blip r:embed="rId15"/>
+                          <a:stretch>
+                            <a:fillRect/>
+                          </a:stretch>
+                        </pic:blipFill>
+                        <pic:spPr>
+                          <a:xfrm>
+                            <a:off x="0" y="0"/>
+                            <a:ext cx="4154152" cy="1472971"/>
+                          </a:xfrm>
+                          <a:prstGeom prst="rect">
+                            <a:avLst/>
+                          </a:prstGeom>
+                        </pic:spPr>
+                      </pic:pic>
+                    </a:graphicData>
+                  </a:graphic>
+                </wp:inline>
+              </w:drawing>
+            </w:r>
+          </w:p>
+          <w:p>
+            <w:pPr>
+              <w:pStyle w:val="ListParagraph"/>
+              <w:ind w:left="720"/>
+            </w:pPr>
           </w:p>
         </w:tc>
       </w:tr>
@@ -1346,16 +1446,137 @@
           </w:p>
           <w:p>
             <w:r>
+              <w:drawing>
+                <wp:inline distT="0" distB="0" distL="0" distR="0" wp14:anchorId="53F5A6AD" wp14:editId="7059EFD8">
+                  <wp:extent cx="3361267" cy="1738145"/>
+                  <wp:effectExtent l="0" t="0" r="0" b="0"/>
+                  <wp:docPr id="12" name="Picture 12"/>
+                  <wp:cNvGraphicFramePr>
+                    <a:graphicFrameLocks xmlns:a="http://schemas.openxmlformats.org/drawingml/2006/main" noChangeAspect="1"/>
+                  </wp:cNvGraphicFramePr>
+                  <a:graphic xmlns:a="http://schemas.openxmlformats.org/drawingml/2006/main">
+                    <a:graphicData uri="http://schemas.openxmlformats.org/drawingml/2006/picture">
+                      <pic:pic xmlns:pic="http://schemas.openxmlformats.org/drawingml/2006/picture">
+                        <pic:nvPicPr>
+                          <pic:cNvPr id="1" name=""/>
+                          <pic:cNvPicPr/>
+                        </pic:nvPicPr>
+                        <pic:blipFill>
+                          <a:blip r:embed="rId16"/>
+                          <a:stretch>
+                            <a:fillRect/>
+                          </a:stretch>
+                        </pic:blipFill>
+                        <pic:spPr>
+                          <a:xfrm>
+                            <a:off x="0" y="0"/>
+                            <a:ext cx="3431189" cy="1774302"/>
+                          </a:xfrm>
+                          <a:prstGeom prst="rect">
+                            <a:avLst/>
+                          </a:prstGeom>
+                        </pic:spPr>
+                      </pic:pic>
+                    </a:graphicData>
+                  </a:graphic>
+                </wp:inline>
+              </w:drawing>
+            </w:r>
+          </w:p>
+          <w:p>
+            <w:r>
               <w:t xml:space="preserve">/shop/clothes/tops </w:t>
             </w:r>
           </w:p>
           <w:p>
+            <w:bookmarkStart w:id="0" w:name="_GoBack"/>
+            <w:r>
+              <w:drawing>
+                <wp:inline distT="0" distB="0" distL="0" distR="0" wp14:anchorId="188262F5" wp14:editId="0A546B58">
+                  <wp:extent cx="3371492" cy="1701800"/>
+                  <wp:effectExtent l="0" t="0" r="635" b="0"/>
+                  <wp:docPr id="13" name="Picture 13"/>
+                  <wp:cNvGraphicFramePr>
+                    <a:graphicFrameLocks xmlns:a="http://schemas.openxmlformats.org/drawingml/2006/main" noChangeAspect="1"/>
+                  </wp:cNvGraphicFramePr>
+                  <a:graphic xmlns:a="http://schemas.openxmlformats.org/drawingml/2006/main">
+                    <a:graphicData uri="http://schemas.openxmlformats.org/drawingml/2006/picture">
+                      <pic:pic xmlns:pic="http://schemas.openxmlformats.org/drawingml/2006/picture">
+                        <pic:nvPicPr>
+                          <pic:cNvPr id="1" name=""/>
+                          <pic:cNvPicPr/>
+                        </pic:nvPicPr>
+                        <pic:blipFill>
+                          <a:blip r:embed="rId17"/>
+                          <a:stretch>
+                            <a:fillRect/>
+                          </a:stretch>
+                        </pic:blipFill>
+                        <pic:spPr>
+                          <a:xfrm>
+                            <a:off x="0" y="0"/>
+                            <a:ext cx="3443827" cy="1738312"/>
+                          </a:xfrm>
+                          <a:prstGeom prst="rect">
+                            <a:avLst/>
+                          </a:prstGeom>
+                        </pic:spPr>
+                      </pic:pic>
+                    </a:graphicData>
+                  </a:graphic>
+                </wp:inline>
+              </w:drawing>
+            </w:r>
+            <w:bookmarkEnd w:id="0"/>
+          </w:p>
+          <w:p>
             <w:r>
               <w:t>/shop/clothes/tops/t-shirt</w:t>
             </w:r>
           </w:p>
           <w:p>
             <w:r>
+              <w:drawing>
+                <wp:inline distT="0" distB="0" distL="0" distR="0" wp14:anchorId="45FB95B8" wp14:editId="3639B9C7">
+                  <wp:extent cx="3344334" cy="1713730"/>
+                  <wp:effectExtent l="0" t="0" r="8890" b="1270"/>
+                  <wp:docPr id="14" name="Picture 14"/>
+                  <wp:cNvGraphicFramePr>
+                    <a:graphicFrameLocks xmlns:a="http://schemas.openxmlformats.org/drawingml/2006/main" noChangeAspect="1"/>
+                  </wp:cNvGraphicFramePr>
+                  <a:graphic xmlns:a="http://schemas.openxmlformats.org/drawingml/2006/main">
+                    <a:graphicData uri="http://schemas.openxmlformats.org/drawingml/2006/picture">
+                      <pic:pic xmlns:pic="http://schemas.openxmlformats.org/drawingml/2006/picture">
+                        <pic:nvPicPr>
+                          <pic:cNvPr id="1" name=""/>
+                          <pic:cNvPicPr/>
+                        </pic:nvPicPr>
+                        <pic:blipFill>
+                          <a:blip r:embed="rId18"/>
+                          <a:stretch>
+                            <a:fillRect/>
+                          </a:stretch>
+                        </pic:blipFill>
+                        <pic:spPr>
+                          <a:xfrm>
+                            <a:off x="0" y="0"/>
+                            <a:ext cx="3414526" cy="1749698"/>
+                          </a:xfrm>
+                          <a:prstGeom prst="rect">
+                            <a:avLst/>
+                          </a:prstGeom>
+                        </pic:spPr>
+                      </pic:pic>
+                    </a:graphicData>
+                  </a:graphic>
+                </wp:inline>
+              </w:drawing>
+            </w:r>
+          </w:p>
+          <w:p/>
+          <w:p>
+            <w:r>
+              <w:lastRenderedPageBreak/>
               <w:t xml:space="preserve">Jika dilihat ada yang terbaca undifined dan ada yang tidak terbaca ini dikarena segmennya dibatasi Cuma array[0] dan array[1]. Solusinya bagaimana ? </w:t>
             </w:r>
           </w:p>
@@ -1395,7 +1616,6 @@
               </w:numPr>
             </w:pPr>
             <w:r>
-              <w:lastRenderedPageBreak/>
               <w:t>Isi halaman berubah sesuai URL</w:t>
             </w:r>
           </w:p>
@@ -2278,6 +2498,7 @@
           <w:rFonts w:ascii="Times New Roman" w:hAnsi="Times New Roman" w:cs="Times New Roman"/>
           <w:color w:val="auto"/>
         </w:rPr>
+        <w:lastRenderedPageBreak/>
         <w:t>Langkah 8 – Simulasi Redirect (Belum Login)</w:t>
       </w:r>
     </w:p>
@@ -2803,8 +3024,8 @@
       </w:pPr>
     </w:p>
     <w:sectPr>
-      <w:headerReference w:type="default" r:id="rId14"/>
-      <w:footerReference w:type="default" r:id="rId15"/>
+      <w:headerReference w:type="default" r:id="rId19"/>
+      <w:footerReference w:type="default" r:id="rId20"/>
       <w:pgSz w:w="11900" w:h="16820"/>
       <w:pgMar w:top="2080" w:right="1133" w:bottom="1060" w:left="992" w:header="567" w:footer="753" w:gutter="0"/>
       <w:cols w:space="720"/>
@@ -2914,7 +3135,7 @@
         </mc:Choice>
         <mc:Fallback>
           <w:pict>
-            <v:shape w14:anchorId="459585D8" id="Graphic 58" o:spid="_x0000_s1026" style="position:absolute;margin-left:56.7pt;margin-top:784.15pt;width:481.9pt;height:.1pt;z-index:-251643904;visibility:visible;mso-wrap-style:square;mso-wrap-distance-left:0;mso-wrap-distance-top:0;mso-wrap-distance-right:0;mso-wrap-distance-bottom:0;mso-position-horizontal:absolute;mso-position-horizontal-relative:page;mso-position-vertical:absolute;mso-position-vertical-relative:page;v-text-anchor:top" coordsize="6120130,1270" o:gfxdata="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" path="m,l6120130,e" filled="f">
+            <v:shape w14:anchorId="428FCC9B" id="Graphic 58" o:spid="_x0000_s1026" style="position:absolute;margin-left:56.7pt;margin-top:784.15pt;width:481.9pt;height:.1pt;z-index:-251643904;visibility:visible;mso-wrap-style:square;mso-wrap-distance-left:0;mso-wrap-distance-top:0;mso-wrap-distance-right:0;mso-wrap-distance-bottom:0;mso-position-horizontal:absolute;mso-position-horizontal-relative:page;mso-position-vertical:absolute;mso-position-vertical-relative:page;v-text-anchor:top" coordsize="6120130,1270" o:gfxdata="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" path="m,l6120130,e" filled="f">
               <v:path arrowok="t"/>
               <w10:wrap anchorx="page" anchory="page"/>
             </v:shape>
@@ -3519,7 +3740,7 @@
         </mc:Choice>
         <mc:Fallback>
           <w:pict>
-            <v:shape w14:anchorId="4EB58100" id="Graphic 56" o:spid="_x0000_s1026" style="position:absolute;margin-left:56.7pt;margin-top:103.65pt;width:481.9pt;height:.1pt;z-index:-251645952;visibility:visible;mso-wrap-style:square;mso-wrap-distance-left:0;mso-wrap-distance-top:0;mso-wrap-distance-right:0;mso-wrap-distance-bottom:0;mso-position-horizontal:absolute;mso-position-horizontal-relative:page;mso-position-vertical:absolute;mso-position-vertical-relative:page;v-text-anchor:top" coordsize="6120130,1270" o:gfxdata="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" path="m,l6120130,e" filled="f" strokeweight="1.5pt">
+            <v:shape w14:anchorId="651A05E8" id="Graphic 56" o:spid="_x0000_s1026" style="position:absolute;margin-left:56.7pt;margin-top:103.65pt;width:481.9pt;height:.1pt;z-index:-251645952;visibility:visible;mso-wrap-style:square;mso-wrap-distance-left:0;mso-wrap-distance-top:0;mso-wrap-distance-right:0;mso-wrap-distance-bottom:0;mso-position-horizontal:absolute;mso-position-horizontal-relative:page;mso-position-vertical:absolute;mso-position-vertical-relative:page;v-text-anchor:top" coordsize="6120130,1270" o:gfxdata="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" path="m,l6120130,e" filled="f" strokeweight="1.5pt">
               <v:path arrowok="t"/>
               <w10:wrap anchorx="page" anchory="page"/>
             </v:shape>

</xml_diff>